<commit_message>
Reviews: fix wrong publication years in the three public examples
54 entries across moral-value-diy (27), extended-mind-cognitive-offloading
(22), metaphilosophy-literature-reviews (5): 50 online-first years set to
the CrossRef version-of-record year, plus 4 adjudicated mismatches
(Gilbert 2020, Anderson 2019, Hohwy 2013, Moran 2006). Fixed in .bib,
review .md (References + in-text), and .docx. Deliberately excluded:
held2006ethics (title-page year), clark1999embodied (edition mismatch),
benson1994free/stoljar2017relational/gordon2020decolonizing (wrong DOI -
different defect). Audit: docs/known-issues/wrong-years-audit-2026-08-05.md
(local-only).

Co-Authored-By: Claude Fable 5 <noreply@anthropic.com>
Claude-Session: https://claude.ai/code/session_015t8fX9E8j4JAG97JBrS2Ji
</commit_message>
<xml_diff>
--- a/reviews/extended-mind-cognitive-offloading/literature-review-final.docx
+++ b/reviews/extended-mind-cognitive-offloading/literature-review-final.docx
@@ -40,7 +40,7 @@
         <w:pStyle w:val="BodyText"/>
       </w:pPr>
       <w:r>
-        <w:t xml:space="preserve">The relationship between these literatures raises a specific problem: philosophical debates about extended cognition engage primarily with conceptual arguments about constitution versus causation, functionalist commitments, and the coupling-constitution inference, while empirical offloading research focuses on measurable behavioral outcomes and mechanisms. Clark (2008) refined the original thesis by introducing trust, glue, and accessibility conditions as constraints on extension, while critics like Adams and Aizawa (2001) challenged the parity principle by arguing that functional equivalence does not establish constitutional status—external resources may be causally coupled with cognitive processes without being constitutive parts of those processes. Meanwhile, Gilbert and colleagues (2022) have established that offloading decisions in prospective memory tasks are guided by metacognitive monitoring of confidence and systematically biased toward overuse of external reminders, while Sparrow, Liu, and Wegner (2011) documented how internet availability transforms memory strategies from internal storage to metamemory for information location. The question is whether and how each literature informs the other—whether empirical findings about offloading mechanisms speak to philosophical debates about cognitive boundaries, and whether philosophical distinctions can structure empirical research programs.</w:t>
+        <w:t xml:space="preserve">The relationship between these literatures raises a specific problem: philosophical debates about extended cognition engage primarily with conceptual arguments about constitution versus causation, functionalist commitments, and the coupling-constitution inference, while empirical offloading research focuses on measurable behavioral outcomes and mechanisms. Clark (2008) refined the original thesis by introducing trust, glue, and accessibility conditions as constraints on extension, while critics like Adams and Aizawa (2001) challenged the parity principle by arguing that functional equivalence does not establish constitutional status—external resources may be causally coupled with cognitive processes without being constitutive parts of those processes. Meanwhile, Gilbert and colleagues (2023) have established that offloading decisions in prospective memory tasks are guided by metacognitive monitoring of confidence and systematically biased toward overuse of external reminders, while Sparrow, Liu, and Wegner (2011) documented how internet availability transforms memory strategies from internal storage to metamemory for information location. The question is whether and how each literature informs the other—whether empirical findings about offloading mechanisms speak to philosophical debates about cognitive boundaries, and whether philosophical distinctions can structure empirical research programs.</w:t>
       </w:r>
     </w:p>
     <w:p>
@@ -252,7 +252,7 @@
         <w:pStyle w:val="BodyText"/>
       </w:pPr>
       <w:r>
-        <w:t xml:space="preserve">Kirchhoff (2013) draws on mechanistic philosophy of science to propose mutual manipulability as a criterion for cognitive constitution. External resources constitute parts of cognitive systems when manipulating them reliably produces changes in cognitive outcomes and vice versa, and when they contribute non-redundantly to cognitive functions. This mechanistic approach offers empirically grounded criteria that avoid both the mark of the cognitive problem and the grain-of-realization issue: what matters is whether external resources are integrated into the causal-mechanistic structure that produces cognitive phenomena, not whether they satisfy intrinsic property criteria or achieve perfect functional parity.</w:t>
+        <w:t xml:space="preserve">Kirchhoff (2014) draws on mechanistic philosophy of science to propose mutual manipulability as a criterion for cognitive constitution. External resources constitute parts of cognitive systems when manipulating them reliably produces changes in cognitive outcomes and vice versa, and when they contribute non-redundantly to cognitive functions. This mechanistic approach offers empirically grounded criteria that avoid both the mark of the cognitive problem and the grain-of-realization issue: what matters is whether external resources are integrated into the causal-mechanistic structure that produces cognitive phenomena, not whether they satisfy intrinsic property criteria or achieve perfect functional parity.</w:t>
       </w:r>
     </w:p>
     <w:p>
@@ -268,7 +268,7 @@
         <w:pStyle w:val="BodyText"/>
       </w:pPr>
       <w:r>
-        <w:t xml:space="preserve">Palermos (2013) develops an epistemological integration framework where extended cognitive systems can ground knowledge when external resources are cognitively transparent (experienced as seamless parts of cognitive processing) and their reliability is trust-independent (does not require ongoing monitoring). This addresses Smithies’s epistemic access objection by showing how integration can restore the kind of transparency and automatic endorsement characteristic of internal belief states. When external resources are deeply integrated through practiced use, the epistemic asymmetry diminishes: a well-integrated notebook functions epistemically like biological memory rather than like testimony from an external source.</w:t>
+        <w:t xml:space="preserve">Palermos (2014) develops an epistemological integration framework where extended cognitive systems can ground knowledge when external resources are cognitively transparent (experienced as seamless parts of cognitive processing) and their reliability is trust-independent (does not require ongoing monitoring). This addresses Smithies’s epistemic access objection by showing how integration can restore the kind of transparency and automatic endorsement characteristic of internal belief states. When external resources are deeply integrated through practiced use, the epistemic asymmetry diminishes: a well-integrated notebook functions epistemically like biological memory rather than like testimony from an external source.</w:t>
       </w:r>
     </w:p>
     <w:p>
@@ -338,7 +338,7 @@
         <w:pStyle w:val="BodyText"/>
       </w:pPr>
       <w:r>
-        <w:t xml:space="preserve">This metacognitive framework has been developed most extensively in research on intention offloading—the use of external reminders to support delayed intentions. Gilbert et al. (2022) synthesize evidence showing that reminder-setting is highly effective at improving prospective memory performance and is systematically guided by metacognitive beliefs about memory ability. However, the relationship between metacognition and offloading involves systematic biases. Gilbert et al. (2018) demonstrate that individuals persistently overuse external reminders relative to the optimal strategy, even when financially incentivized to choose optimally. This bias is predicted by metacognitive underconfidence—participants underestimate their memory abilities. Importantly, the bias can be eliminated through metacognitive advice (informing participants which strategy maximizes performance) and is mediated by manipulations of confidence through feedback, suggesting that offloading strategies are modifiable through metacognitive interventions.</w:t>
+        <w:t xml:space="preserve">This metacognitive framework has been developed most extensively in research on intention offloading—the use of external reminders to support delayed intentions. Gilbert et al. (2023) synthesize evidence showing that reminder-setting is highly effective at improving prospective memory performance and is systematically guided by metacognitive beliefs about memory ability. However, the relationship between metacognition and offloading involves systematic biases. Gilbert et al. (2020) demonstrate that individuals persistently overuse external reminders relative to the optimal strategy, even when financially incentivized to choose optimally. This bias is predicted by metacognitive underconfidence—participants underestimate their memory abilities. Importantly, the bias can be eliminated through metacognitive advice (informing participants which strategy maximizes performance) and is mediated by manipulations of confidence through feedback, suggesting that offloading strategies are modifiable through metacognitive interventions.</w:t>
       </w:r>
     </w:p>
     <w:p>
@@ -388,7 +388,7 @@
         <w:pStyle w:val="FirstParagraph"/>
       </w:pPr>
       <w:r>
-        <w:t xml:space="preserve">Cognitive offloading is not uniform across individuals or contexts but varies systematically with cognitive capacities, developmental stage, and task characteristics. Ball et al. (2021) conducted a large-scale study (N=268) examining how working memory capacity modulates offloading strategies and effectiveness. They found that individuals with higher working memory capacity performed better when relying on internal memory, but this advantage disappeared when reminders were available. Crucially, individuals with lower working memory capacity chose to offload more frequently and benefited more from offloading, suggesting adaptive calibration to internal cognitive limitations. This pattern supports the view that offloading can serve compensatory functions, allowing lower-capacity individuals to achieve performance levels comparable to higher-capacity individuals when external resources are available.</w:t>
+        <w:t xml:space="preserve">Cognitive offloading is not uniform across individuals or contexts but varies systematically with cognitive capacities, developmental stage, and task characteristics. Ball et al. (2022) conducted a large-scale study (N=268) examining how working memory capacity modulates offloading strategies and effectiveness. They found that individuals with higher working memory capacity performed better when relying on internal memory, but this advantage disappeared when reminders were available. Crucially, individuals with lower working memory capacity chose to offload more frequently and benefited more from offloading, suggesting adaptive calibration to internal cognitive limitations. This pattern supports the view that offloading can serve compensatory functions, allowing lower-capacity individuals to achieve performance levels comparable to higher-capacity individuals when external resources are available.</w:t>
       </w:r>
     </w:p>
     <w:p>
@@ -404,15 +404,15 @@
         <w:pStyle w:val="BodyText"/>
       </w:pPr>
       <w:r>
-        <w:t xml:space="preserve">Developmental research reveals that offloading capacities and biases shift across the lifespan. Armitage et al. (2021) demonstrate that children as young as 4-5 years spontaneously devise external memory strategies without explicit instruction. When shown a task where target locations were shuffled out of view, these children independently placed markers on target containers to support later retrieval. Three-year-olds could use the strategy when demonstrated but did not generate it spontaneously, suggesting that the metacognitive capacity to recognize future uncertainty and proactively create external aids emerges between ages 3-4. This early emergence suggests that offloading may be a fundamental aspect of human cognitive architecture rather than a modern technological phenomenon—humans appear naturally disposed to create and use external memory supports.</w:t>
-      </w:r>
-    </w:p>
-    <w:p>
-      <w:pPr>
-        <w:pStyle w:val="BodyText"/>
-      </w:pPr>
-      <w:r>
-        <w:t xml:space="preserve">However, the calibration of offloading to actual need develops gradually. Sun et al. (2024) examined offloading bias across ages 7-15 and found a striking developmental reversal. Primary school students (ages 7-11) tended to under-offload, relying excessively on internal memory compared to the optimal strategy. This under-reliance was linked to inaccurate metacognitive monitoring—younger children overestimated their memory abilities. By contrast, secondary school students (ages 12-15) showed the opposite pattern, over-relying on external aids. The shift from under-offloading to over-offloading suggests that appropriate external resource use requires developmental calibration of metacognitive accuracy, and different age groups make opposite errors in this calibration process.</w:t>
+        <w:t xml:space="preserve">Developmental research reveals that offloading capacities and biases shift across the lifespan. Armitage et al. (2022) demonstrate that children as young as 4-5 years spontaneously devise external memory strategies without explicit instruction. When shown a task where target locations were shuffled out of view, these children independently placed markers on target containers to support later retrieval. Three-year-olds could use the strategy when demonstrated but did not generate it spontaneously, suggesting that the metacognitive capacity to recognize future uncertainty and proactively create external aids emerges between ages 3-4. This early emergence suggests that offloading may be a fundamental aspect of human cognitive architecture rather than a modern technological phenomenon—humans appear naturally disposed to create and use external memory supports.</w:t>
+      </w:r>
+    </w:p>
+    <w:p>
+      <w:pPr>
+        <w:pStyle w:val="BodyText"/>
+      </w:pPr>
+      <w:r>
+        <w:t xml:space="preserve">However, the calibration of offloading to actual need develops gradually. Sun et al. (2025) examined offloading bias across ages 7-15 and found a striking developmental reversal. Primary school students (ages 7-11) tended to under-offload, relying excessively on internal memory compared to the optimal strategy. This under-reliance was linked to inaccurate metacognitive monitoring—younger children overestimated their memory abilities. By contrast, secondary school students (ages 12-15) showed the opposite pattern, over-relying on external aids. The shift from under-offloading to over-offloading suggests that appropriate external resource use requires developmental calibration of metacognitive accuracy, and different age groups make opposite errors in this calibration process.</w:t>
       </w:r>
     </w:p>
     <w:p>
@@ -521,15 +521,15 @@
         <w:t xml:space="preserve"> </w:t>
       </w:r>
       <w:r>
-        <w:t xml:space="preserve">framework that treats the Internet as a transformative cognitive niche rather than simply an external tool. The Internet creates an environment characterized by information abundance, networked social interaction, and constantly evolving knowledge structures. This ecological perspective reframes the question from whether specific Internet tools extend cognition to how Internet environments reshape cognitive practices across multiple dimensions. Heersmink and Sutton (2018) argue that different online practices fit different theoretical frameworks: some web-based activities may satisfy extended mind criteria (personal cloud storage, customized information systems), others function as transactive memory systems (knowing which online sources to consult), while still others merely scaffold cognition without constituting cognitive processes. This pluralistic analysis suggests that the Internet supports multiple types of brain-environment coupling simultaneously, complicating any unified verdict about Internet-extended cognition.</w:t>
-      </w:r>
-    </w:p>
-    <w:p>
-      <w:pPr>
-        <w:pStyle w:val="BodyText"/>
-      </w:pPr>
-      <w:r>
-        <w:t xml:space="preserve">Heersmink (2016) examines how Internet use affects the values that structure cognition—epistemic virtues including accuracy, speed, reliability, and understanding. He argues that while Internet search enhances speed and extends accessible knowledge, it may undermine deeper understanding and sustained critical evaluation. This normative dimension reveals that even if Internet use constitutes cognitive extension in some functional sense, we must evaluate what kind of cognition it produces. Schwengerer (2020) develops this concern into a philosophical argument: first-wave extended mind theory based on parity principles is incompatible with the intellectual virtues required for epistemically responsible Internet use. If external resources count as cognitive simply when functionally equivalent to internal processes, agents have no special epistemic obligations toward them. But responsible Internet use requires agents to critically evaluate sources, maintain informational hygiene, and actively curate their cognitive environments. Schwengerer proposes that second-wave theories emphasizing integration and gradient accounts of extension better accommodate these virtue requirements, as they preserve the distinction between coupled resources that require ongoing management and fully integrated cognitive components.</w:t>
+        <w:t xml:space="preserve">framework that treats the Internet as a transformative cognitive niche rather than simply an external tool. The Internet creates an environment characterized by information abundance, networked social interaction, and constantly evolving knowledge structures. This ecological perspective reframes the question from whether specific Internet tools extend cognition to how Internet environments reshape cognitive practices across multiple dimensions. Heersmink and Sutton (2020) argue that different online practices fit different theoretical frameworks: some web-based activities may satisfy extended mind criteria (personal cloud storage, customized information systems), others function as transactive memory systems (knowing which online sources to consult), while still others merely scaffold cognition without constituting cognitive processes. This pluralistic analysis suggests that the Internet supports multiple types of brain-environment coupling simultaneously, complicating any unified verdict about Internet-extended cognition.</w:t>
+      </w:r>
+    </w:p>
+    <w:p>
+      <w:pPr>
+        <w:pStyle w:val="BodyText"/>
+      </w:pPr>
+      <w:r>
+        <w:t xml:space="preserve">Heersmink (2016) examines how Internet use affects the values that structure cognition—epistemic virtues including accuracy, speed, reliability, and understanding. He argues that while Internet search enhances speed and extends accessible knowledge, it may undermine deeper understanding and sustained critical evaluation. This normative dimension reveals that even if Internet use constitutes cognitive extension in some functional sense, we must evaluate what kind of cognition it produces. Schwengerer (2021) develops this concern into a philosophical argument: first-wave extended mind theory based on parity principles is incompatible with the intellectual virtues required for epistemically responsible Internet use. If external resources count as cognitive simply when functionally equivalent to internal processes, agents have no special epistemic obligations toward them. But responsible Internet use requires agents to critically evaluate sources, maintain informational hygiene, and actively curate their cognitive environments. Schwengerer proposes that second-wave theories emphasizing integration and gradient accounts of extension better accommodate these virtue requirements, as they preserve the distinction between coupled resources that require ongoing management and fully integrated cognitive components.</w:t>
       </w:r>
     </w:p>
     <w:p>
@@ -591,7 +591,7 @@
         <w:pStyle w:val="BodyText"/>
       </w:pPr>
       <w:r>
-        <w:t xml:space="preserve">Two recent meta-analyses provide quantitative synthesis of the accumulated evidence, yielding partially divergent assessments. Böttger et al. (2023) analyzed 22 studies and found a significant overall negative effect of smartphone presence on cognitive performance across memory, attention, and general cognitive tasks. However, they documented substantial heterogeneity in effect sizes, varying by cognitive domain and participant nationality, suggesting moderating factors not yet fully understood. Parry (2023) conducted a more comprehensive meta-analysis of 56 studies (n=7,093) and found limited support for the brain drain hypothesis. Only working memory capacity showed a statistically significant negative effect of smartphone presence; sustained attention, response inhibition, and fluid intelligence showed null effects. Parry’s analysis also revealed substantial methodological heterogeneity across studies and generally poor statistical power, limiting confidence in the evidence base. The meta-analytic evidence thus suggests that if brain drain effects exist, they are domain-specific (primarily affecting working memory), smaller than originally claimed, and moderated by factors not yet systematically identified.</w:t>
+        <w:t xml:space="preserve">Two recent meta-analyses provide quantitative synthesis of the accumulated evidence, yielding partially divergent assessments. Böttger et al. (2023) analyzed 22 studies and found a significant overall negative effect of smartphone presence on cognitive performance across memory, attention, and general cognitive tasks. However, they documented substantial heterogeneity in effect sizes, varying by cognitive domain and participant nationality, suggesting moderating factors not yet fully understood. Parry (2024) conducted a more comprehensive meta-analysis of 56 studies (n=7,093) and found limited support for the brain drain hypothesis. Only working memory capacity showed a statistically significant negative effect of smartphone presence; sustained attention, response inhibition, and fluid intelligence showed null effects. Parry’s analysis also revealed substantial methodological heterogeneity across studies and generally poor statistical power, limiting confidence in the evidence base. The meta-analytic evidence thus suggests that if brain drain effects exist, they are domain-specific (primarily affecting working memory), smaller than originally claimed, and moderated by factors not yet systematically identified.</w:t>
       </w:r>
     </w:p>
     <w:p>
@@ -642,7 +642,7 @@
         <w:pStyle w:val="BodyText"/>
       </w:pPr>
       <w:r>
-        <w:t xml:space="preserve">Andrada, Clowes, and Smart (2022) examine how AI system opacity affects cognitive agency when such systems are integrated into human cognitive practices. They distinguish different dimensions of transparency—functional, procedural, epistemic—and argue that different forms matter for different aspects of cognitive agency. When AI systems function as cognitive resources through offloading, transparency requirements differ from when humans merely use AI outputs. The analysis reveals tensions between the extended mind framework’s emphasis on functional integration and the normative requirements for maintaining human agency within AI-augmented cognitive systems. If external cognitive resources are algorithmically opaque and adaptively changing, agents may lose the kind of understanding and control required for cognitive self-determination even when such resources enhance functional performance.</w:t>
+        <w:t xml:space="preserve">Andrada, Clowes, and Smart (2023) examine how AI system opacity affects cognitive agency when such systems are integrated into human cognitive practices. They distinguish different dimensions of transparency—functional, procedural, epistemic—and argue that different forms matter for different aspects of cognitive agency. When AI systems function as cognitive resources through offloading, transparency requirements differ from when humans merely use AI outputs. The analysis reveals tensions between the extended mind framework’s emphasis on functional integration and the normative requirements for maintaining human agency within AI-augmented cognitive systems. If external cognitive resources are algorithmically opaque and adaptively changing, agents may lose the kind of understanding and control required for cognitive self-determination even when such resources enhance functional performance.</w:t>
       </w:r>
     </w:p>
     <w:p>
@@ -734,7 +734,7 @@
         <w:pStyle w:val="BodyText"/>
       </w:pPr>
       <w:r>
-        <w:t xml:space="preserve">The enactivist critique extends beyond representation. Di Paolo (2008) argues that extended mind does not go far enough in breaking with cognitivist assumptions, proposing instead an</w:t>
+        <w:t xml:space="preserve">The enactivist critique extends beyond representation. Di Paolo (2009) argues that extended mind does not go far enough in breaking with cognitivist assumptions, proposing instead an</w:t>
       </w:r>
       <w:r>
         <w:t xml:space="preserve"> </w:t>
@@ -769,7 +769,7 @@
         <w:pStyle w:val="BodyText"/>
       </w:pPr>
       <w:r>
-        <w:t xml:space="preserve">Predictive processing offers a different alternative framework with contested implications for extended cognition. Clark (2013) argues that prediction error minimization naturally supports extended mind through active inference: brains are hierarchical prediction machines that minimize prediction error through cascading top-down predictions and bottom-up error signals, and this framework extends to action—acting on the environment to make predictions come true. External resources can participate in prediction error minimization loops, supporting cognitive extension. However, Hohwy (2016) argues that the evidentiary boundary at sensory surfaces creates principled cognitive boundaries, making predictive processing internalist rather than externalist. The brain’s task is to infer hidden causes of sensory input from behind this</w:t>
+        <w:t xml:space="preserve">Predictive processing offers a different alternative framework with contested implications for extended cognition. Clark (2013) argues that prediction error minimization naturally supports extended mind through active inference: brains are hierarchical prediction machines that minimize prediction error through cascading top-down predictions and bottom-up error signals, and this framework extends to action—acting on the environment to make predictions come true. External resources can participate in prediction error minimization loops, supporting cognitive extension. However, Hohwy (2013) argues that the evidentiary boundary at sensory surfaces creates principled cognitive boundaries, making predictive processing internalist rather than externalist. The brain’s task is to infer hidden causes of sensory input from behind this</w:t>
       </w:r>
       <w:r>
         <w:t xml:space="preserve"> </w:t>
@@ -860,7 +860,7 @@
         <w:pStyle w:val="BodyText"/>
       </w:pPr>
       <w:r>
-        <w:t xml:space="preserve">The methodological concerns connect to normative questions about cognitive autonomy. Padalko (2025) argues that IoT environments reduce cognitive autonomy through algorithmic mediation and platform dependency. Even if cognitive extension is philosophically coherent, widespread offloading to digital and AI systems may raise distinct normative questions about autonomy and cognitive self-determination. Andrada, Clowes, and Smart (2022) examine how AI system opacity affects cognitive agency when such systems are integrated into human cognitive practices. They distinguish different transparency dimensions (functional, procedural, epistemic) and argue that different forms of transparency matter for different aspects of cognitive agency. When AI systems function as cognitive resources through offloading, transparency requirements differ from when humans merely use AI outputs. Whether opaque AI systems can genuinely extend cognition or whether transparency is necessary for cognitive integration remains contested.</w:t>
+        <w:t xml:space="preserve">The methodological concerns connect to normative questions about cognitive autonomy. Padalko (2025) argues that IoT environments reduce cognitive autonomy through algorithmic mediation and platform dependency. Even if cognitive extension is philosophically coherent, widespread offloading to digital and AI systems may raise distinct normative questions about autonomy and cognitive self-determination. Andrada, Clowes, and Smart (2023) examine how AI system opacity affects cognitive agency when such systems are integrated into human cognitive practices. They distinguish different transparency dimensions (functional, procedural, epistemic) and argue that different forms of transparency matter for different aspects of cognitive agency. When AI systems function as cognitive resources through offloading, transparency requirements differ from when humans merely use AI outputs. Whether opaque AI systems can genuinely extend cognition or whether transparency is necessary for cognitive integration remains contested.</w:t>
       </w:r>
     </w:p>
     <w:p>
@@ -923,15 +923,15 @@
         <w:pStyle w:val="BodyText"/>
       </w:pPr>
       <w:r>
-        <w:t xml:space="preserve">The empirical cognitive offloading literature has developed largely independently, establishing that offloading decisions are governed by metacognitive monitoring processes rather than simple capacity limits (Risko and Dunn 2015; Gilbert et al. 2022). People offload based on confidence judgments about their internal abilities, yet show systematic biases toward overusing external aids (Gilbert et al. 2018; Sachdeva and Gilbert 2020). Individual differences research reveals that offloading is modulated by working memory capacity (Ball et al. 2021), varies across task contexts (Meyerhoff et al. 2021), and shifts developmentally—with young children under-offloading due to overconfidence and adolescents over-offloading (Sun et al. 2024). Neuroscientific findings identify prefrontal-parietal networks supporting metacognitive control of offloading, with distinct but overlapping patterns for monitoring and control processes (Boldt and Gilbert 2022; Zheng et al. 2025).</w:t>
-      </w:r>
-    </w:p>
-    <w:p>
-      <w:pPr>
-        <w:pStyle w:val="BodyText"/>
-      </w:pPr>
-      <w:r>
-        <w:t xml:space="preserve">Digital technologies—smartphones, the Internet, AI systems—present contemporary test cases where philosophical and empirical questions converge. Internet-based offloading has generated competing interpretations: Smart (2017) and Heersmink and Sutton (2018) analyze web cognition through multiple frameworks (extended mind, transactive memory, scaffolding), acknowledging that different online practices may fit different frameworks. Empirical evidence about smartphone impacts remains contested, with Ward et al.’s (2017)</w:t>
+        <w:t xml:space="preserve">The empirical cognitive offloading literature has developed largely independently, establishing that offloading decisions are governed by metacognitive monitoring processes rather than simple capacity limits (Risko and Dunn 2015; Gilbert et al. 2023). People offload based on confidence judgments about their internal abilities, yet show systematic biases toward overusing external aids (Gilbert et al. 2020; Sachdeva and Gilbert 2020). Individual differences research reveals that offloading is modulated by working memory capacity (Ball et al. 2022), varies across task contexts (Meyerhoff et al. 2021), and shifts developmentally—with young children under-offloading due to overconfidence and adolescents over-offloading (Sun et al. 2025). Neuroscientific findings identify prefrontal-parietal networks supporting metacognitive control of offloading, with distinct but overlapping patterns for monitoring and control processes (Boldt and Gilbert 2022; Zheng et al. 2025).</w:t>
+      </w:r>
+    </w:p>
+    <w:p>
+      <w:pPr>
+        <w:pStyle w:val="BodyText"/>
+      </w:pPr>
+      <w:r>
+        <w:t xml:space="preserve">Digital technologies—smartphones, the Internet, AI systems—present contemporary test cases where philosophical and empirical questions converge. Internet-based offloading has generated competing interpretations: Smart (2017) and Heersmink and Sutton (2020) analyze web cognition through multiple frameworks (extended mind, transactive memory, scaffolding), acknowledging that different online practices may fit different frameworks. Empirical evidence about smartphone impacts remains contested, with Ward et al.’s (2017)</w:t>
       </w:r>
       <w:r>
         <w:t xml:space="preserve"> </w:t>
@@ -943,7 +943,7 @@
         <w:t xml:space="preserve"> </w:t>
       </w:r>
       <w:r>
-        <w:t xml:space="preserve">hypothesis facing replication difficulties (Ruiz Pardo and Minda 2022) and meta-analytic results showing heterogeneous effects (Bottger et al. 2023; Parry 2023). The Google effect (Sparrow et al. 2011) demonstrates that internet availability alters what information is encoded, shifting memory strategies from content storage to location tracking.</w:t>
+        <w:t xml:space="preserve">hypothesis facing replication difficulties (Ruiz Pardo and Minda 2022) and meta-analytic results showing heterogeneous effects (Bottger et al. 2023; Parry 2024). The Google effect (Sparrow et al. 2011) demonstrates that internet availability alters what information is encoded, shifting memory strategies from content storage to location tracking.</w:t>
       </w:r>
     </w:p>
     <w:p>
@@ -959,15 +959,15 @@
         <w:pStyle w:val="BodyText"/>
       </w:pPr>
       <w:r>
-        <w:t xml:space="preserve">Several key tensions persist. First, the scaffolding-extension distinction: Does the metacognitive management revealed by offloading research—where agents actively monitor and control the boundary between internal and external resources—support or undermine claims about seamless cognitive extension? The finding that offloading requires ongoing metacognitive assessment suggests external resources are not transparently integrated but actively managed, potentially favoring scaffolding over extension accounts. Second, the heterogeneity problem: If offloading strategies are task-specific rather than domain-general (Meyerhoff et al. 2021), and if individual differences are substantial, can any unified philosophical account capture all forms of cognitive offloading? Third, the normative dimension: Contemporary concerns about cognitive autonomy in AI-mediated environments (Padalko 2025; Andrada, Clowes, and Smart 2022; Chiriatti et al. 2025) complicate purely descriptive extended mind claims. Even if philosophical arguments support cognitive extension, the algorithmic mediation and opacity of digital cognitive tools raise distinct questions about cognitive self-determination.</w:t>
-      </w:r>
-    </w:p>
-    <w:p>
-      <w:pPr>
-        <w:pStyle w:val="BodyText"/>
-      </w:pPr>
-      <w:r>
-        <w:t xml:space="preserve">Alternative frameworks challenge whether extended mind provides the best conceptual tools for understanding offloading phenomena. Radical enactivism (Hutto and Myin 2013) rejects the representational assumptions underlying both internalist and extended mind positions, suggesting that much offloading may involve sensorimotor reconfiguration rather than redistribution of representational content. Predictive processing offers competing interpretations: Clark (2013) argues that prediction error minimization naturally extends across brain-environment boundaries, while Hohwy (2016) contends that evidentiary boundaries at sensory surfaces create principled cognitive limits. Hutchins’ (2010) cognitive ecology framework sidesteps individuation questions entirely, focusing on how cognitive ecosystems are assembled rather than where cognitive boundaries lie.</w:t>
+        <w:t xml:space="preserve">Several key tensions persist. First, the scaffolding-extension distinction: Does the metacognitive management revealed by offloading research—where agents actively monitor and control the boundary between internal and external resources—support or undermine claims about seamless cognitive extension? The finding that offloading requires ongoing metacognitive assessment suggests external resources are not transparently integrated but actively managed, potentially favoring scaffolding over extension accounts. Second, the heterogeneity problem: If offloading strategies are task-specific rather than domain-general (Meyerhoff et al. 2021), and if individual differences are substantial, can any unified philosophical account capture all forms of cognitive offloading? Third, the normative dimension: Contemporary concerns about cognitive autonomy in AI-mediated environments (Padalko 2025; Andrada, Clowes, and Smart 2023; Chiriatti et al. 2025) complicate purely descriptive extended mind claims. Even if philosophical arguments support cognitive extension, the algorithmic mediation and opacity of digital cognitive tools raise distinct questions about cognitive self-determination.</w:t>
+      </w:r>
+    </w:p>
+    <w:p>
+      <w:pPr>
+        <w:pStyle w:val="BodyText"/>
+      </w:pPr>
+      <w:r>
+        <w:t xml:space="preserve">Alternative frameworks challenge whether extended mind provides the best conceptual tools for understanding offloading phenomena. Radical enactivism (Hutto and Myin 2013) rejects the representational assumptions underlying both internalist and extended mind positions, suggesting that much offloading may involve sensorimotor reconfiguration rather than redistribution of representational content. Predictive processing offers competing interpretations: Clark (2013) argues that prediction error minimization naturally extends across brain-environment boundaries, while Hohwy (2013) contends that evidentiary boundaries at sensory surfaces create principled cognitive limits. Hutchins’ (2010) cognitive ecology framework sidesteps individuation questions entirely, focusing on how cognitive ecosystems are assembled rather than where cognitive boundaries lie.</w:t>
       </w:r>
     </w:p>
     <w:p>
@@ -1085,7 +1085,7 @@
         <w:pStyle w:val="BodyText"/>
       </w:pPr>
       <w:r>
-        <w:t xml:space="preserve">Andrada, Gloria, Robert W. Clowes, and Paul R. Smart. 2022.</w:t>
+        <w:t xml:space="preserve">Andrada, Gloria, Robert W. Clowes, and Paul R. Smart. 2023.</w:t>
       </w:r>
       <w:r>
         <w:t xml:space="preserve"> </w:t>
@@ -1115,7 +1115,7 @@
         <w:pStyle w:val="BodyText"/>
       </w:pPr>
       <w:r>
-        <w:t xml:space="preserve">Armitage, Kristy L., Alex H. Taylor, Thomas Suddendorf, and Jonathan Redshaw. 2021.</w:t>
+        <w:t xml:space="preserve">Armitage, Kristy L., Alex H. Taylor, Thomas Suddendorf, and Jonathan Redshaw. 2022.</w:t>
       </w:r>
       <w:r>
         <w:t xml:space="preserve"> </w:t>
@@ -1145,7 +1145,7 @@
         <w:pStyle w:val="BodyText"/>
       </w:pPr>
       <w:r>
-        <w:t xml:space="preserve">Ball, Benjamin H., Phil Peper, Dzhamilya Alakbarova, Gene A. Brewer, and Sam J. Gilbert. 2021.</w:t>
+        <w:t xml:space="preserve">Ball, Benjamin H., Phil Peper, Dzhamilya Alakbarova, Gene A. Brewer, and Sam J. Gilbert. 2022.</w:t>
       </w:r>
       <w:r>
         <w:t xml:space="preserve"> </w:t>
@@ -1538,7 +1538,7 @@
         <w:pStyle w:val="BodyText"/>
       </w:pPr>
       <w:r>
-        <w:t xml:space="preserve">Di Paolo, Ezequiel. 2008.</w:t>
+        <w:t xml:space="preserve">Di Paolo, Ezequiel. 2009.</w:t>
       </w:r>
       <w:r>
         <w:t xml:space="preserve"> </w:t>
@@ -1628,7 +1628,7 @@
         <w:pStyle w:val="BodyText"/>
       </w:pPr>
       <w:r>
-        <w:t xml:space="preserve">Gilbert, Sam J., Arabella Bird, Jason Carpenter, Stephen M. Fleming, Chhavi Sachdeva, and Pei-Chun Tsai. 2018.</w:t>
+        <w:t xml:space="preserve">Gilbert, Sam J., Arabella Bird, Jason Carpenter, Stephen M. Fleming, Chhavi Sachdeva, and Pei-Chun Tsai. 2020.</w:t>
       </w:r>
       <w:r>
         <w:t xml:space="preserve"> </w:t>
@@ -1658,7 +1658,7 @@
         <w:pStyle w:val="BodyText"/>
       </w:pPr>
       <w:r>
-        <w:t xml:space="preserve">Gilbert, Sam J., Annika Boldt, Chhavi Sachdeva, Chiara Scarampi, and Pei-Chun Tsai. 2022.</w:t>
+        <w:t xml:space="preserve">Gilbert, Sam J., Annika Boldt, Chhavi Sachdeva, Chiara Scarampi, and Pei-Chun Tsai. 2023.</w:t>
       </w:r>
       <w:r>
         <w:t xml:space="preserve"> </w:t>
@@ -1787,7 +1787,7 @@
         <w:pStyle w:val="BodyText"/>
       </w:pPr>
       <w:r>
-        <w:t xml:space="preserve">Heersmink, Richard, and John Sutton. 2018.</w:t>
+        <w:t xml:space="preserve">Heersmink, Richard, and John Sutton. 2020.</w:t>
       </w:r>
       <w:r>
         <w:t xml:space="preserve"> </w:t>
@@ -1817,7 +1817,7 @@
         <w:pStyle w:val="BodyText"/>
       </w:pPr>
       <w:r>
-        <w:t xml:space="preserve">Hohwy, Jakob. 2016.</w:t>
+        <w:t xml:space="preserve">Hohwy, Jakob. 2013.</w:t>
       </w:r>
       <w:r>
         <w:t xml:space="preserve"> </w:t>
@@ -1895,7 +1895,7 @@
         <w:pStyle w:val="BodyText"/>
       </w:pPr>
       <w:r>
-        <w:t xml:space="preserve">Kirchhoff, Michael. 2013.</w:t>
+        <w:t xml:space="preserve">Kirchhoff, Michael. 2014.</w:t>
       </w:r>
       <w:r>
         <w:t xml:space="preserve"> </w:t>
@@ -2129,7 +2129,7 @@
         <w:pStyle w:val="BodyText"/>
       </w:pPr>
       <w:r>
-        <w:t xml:space="preserve">Palermos, Spyridon Orestis. 2013.</w:t>
+        <w:t xml:space="preserve">Palermos, Spyridon Orestis. 2014.</w:t>
       </w:r>
       <w:r>
         <w:t xml:space="preserve"> </w:t>
@@ -2159,7 +2159,7 @@
         <w:pStyle w:val="BodyText"/>
       </w:pPr>
       <w:r>
-        <w:t xml:space="preserve">Parry, Douglas A. 2023.</w:t>
+        <w:t xml:space="preserve">Parry, Douglas A. 2024.</w:t>
       </w:r>
       <w:r>
         <w:t xml:space="preserve"> </w:t>
@@ -2381,7 +2381,7 @@
         <w:pStyle w:val="BodyText"/>
       </w:pPr>
       <w:r>
-        <w:t xml:space="preserve">Schwengerer, Lukas. 2020.</w:t>
+        <w:t xml:space="preserve">Schwengerer, Lukas. 2021.</w:t>
       </w:r>
       <w:r>
         <w:t xml:space="preserve"> </w:t>
@@ -2707,7 +2707,7 @@
         <w:pStyle w:val="BodyText"/>
       </w:pPr>
       <w:r>
-        <w:t xml:space="preserve">Sun, Jiayue, Yanan Wang, Zunyun Hu, Yan Liu, and Yan Sun. 2024.</w:t>
+        <w:t xml:space="preserve">Sun, Jiayue, Yanan Wang, Zunyun Hu, Yan Liu, and Yan Sun. 2025.</w:t>
       </w:r>
       <w:r>
         <w:t xml:space="preserve"> </w:t>

</xml_diff>